<commit_message>
Add cover page, auto table of contents and page numbers to both reports
Front matter for the two deliverables: university header, project title, the
condensed/full variant label, student and supervisor details, then a MỤC LỤC page
and the existing content starting on a fresh page.

The TOC is a real Word TOC field (\o "1-3" \h \z \u) marked dirty, not a
hand-typed list, so the word processor computes the page numbers itself and they
stay correct if the content shifts. A PAGE field in the footer numbers the pages.
MỤC LỤC is deliberately styled as a plain bold paragraph rather than Heading 1,
so it does not list itself inside its own TOC.
</commit_message>
<xml_diff>
--- a/docs/BaoCaoDoAn.docx
+++ b/docs/BaoCaoDoAn.docx
@@ -4,6 +4,205 @@
   <w:body>
     <w:p>
       <w:pPr>
+        <w:spacing w:after="40"/>
+        <w:jc w:val="center"/>
+      </w:pPr>
+      <w:r>
+        <w:rPr>
+          <w:b/>
+          <w:i w:val="0"/>
+          <w:sz w:val="34"/>
+        </w:rPr>
+        <w:t>ĐẠI HỌC BÁCH KHOA HÀ NỘI</w:t>
+      </w:r>
+    </w:p>
+    <w:p>
+      <w:pPr>
+        <w:spacing w:after="1040"/>
+        <w:jc w:val="center"/>
+      </w:pPr>
+      <w:r>
+        <w:rPr>
+          <w:b/>
+          <w:i w:val="0"/>
+          <w:sz w:val="28"/>
+        </w:rPr>
+        <w:t>TRƯỜNG CÔNG NGHỆ THÔNG TIN VÀ TRUYỀN THÔNG</w:t>
+      </w:r>
+    </w:p>
+    <w:p>
+      <w:pPr>
+        <w:spacing w:after="600"/>
+        <w:jc w:val="center"/>
+      </w:pPr>
+      <w:r>
+        <w:rPr>
+          <w:b/>
+          <w:i w:val="0"/>
+          <w:sz w:val="26"/>
+        </w:rPr>
+        <w:t>BÁO CÁO ĐỒ ÁN MÔN HỌC</w:t>
+      </w:r>
+    </w:p>
+    <w:p>
+      <w:pPr>
+        <w:spacing w:after="280"/>
+        <w:jc w:val="center"/>
+      </w:pPr>
+      <w:r>
+        <w:rPr>
+          <w:b/>
+          <w:i w:val="0"/>
+          <w:sz w:val="38"/>
+        </w:rPr>
+        <w:t>PHÁT HIỆN BẤT THƯỜNG NHỊP TIM TỪ TÍN HIỆU ĐIỆN TÂM ĐỒ (ECG) VÀ TRIỂN KHAI TRÊN VI ĐIỀU KHIỂN ESP32</w:t>
+      </w:r>
+    </w:p>
+    <w:p>
+      <w:pPr>
+        <w:spacing w:after="120"/>
+        <w:jc w:val="center"/>
+      </w:pPr>
+      <w:r>
+        <w:rPr>
+          <w:b w:val="0"/>
+          <w:i/>
+          <w:sz w:val="22"/>
+        </w:rPr>
+        <w:t>So sánh sáu họ mô hình học máy — Random Forest, XGBoost, SVM, 1D CNN, LSTM và CNN-LSTM (CRNN) — dưới ràng buộc phần cứng thực tế của TinyML</w:t>
+      </w:r>
+    </w:p>
+    <w:p>
+      <w:pPr>
+        <w:spacing w:after="1120"/>
+        <w:jc w:val="center"/>
+      </w:pPr>
+      <w:r>
+        <w:rPr>
+          <w:b w:val="0"/>
+          <w:i/>
+          <w:sz w:val="22"/>
+        </w:rPr>
+        <w:t>(Bản cô đọng)</w:t>
+      </w:r>
+    </w:p>
+    <w:p>
+      <w:pPr>
+        <w:spacing w:after="80"/>
+        <w:jc w:val="center"/>
+      </w:pPr>
+      <w:r>
+        <w:rPr>
+          <w:b/>
+          <w:sz w:val="24"/>
+        </w:rPr>
+        <w:t xml:space="preserve">Sinh viên thực hiện: </w:t>
+      </w:r>
+      <w:r>
+        <w:rPr>
+          <w:sz w:val="24"/>
+        </w:rPr>
+        <w:t>Tạ Đình Thiện</w:t>
+      </w:r>
+    </w:p>
+    <w:p>
+      <w:pPr>
+        <w:spacing w:after="80"/>
+        <w:jc w:val="center"/>
+      </w:pPr>
+      <w:r>
+        <w:rPr>
+          <w:b/>
+          <w:sz w:val="24"/>
+        </w:rPr>
+        <w:t xml:space="preserve">MSSV: </w:t>
+      </w:r>
+      <w:r>
+        <w:rPr>
+          <w:sz w:val="24"/>
+        </w:rPr>
+        <w:t>20235839</w:t>
+      </w:r>
+    </w:p>
+    <w:p>
+      <w:pPr>
+        <w:spacing w:after="80"/>
+        <w:jc w:val="center"/>
+      </w:pPr>
+      <w:r>
+        <w:rPr>
+          <w:b/>
+          <w:sz w:val="24"/>
+        </w:rPr>
+        <w:t xml:space="preserve">Giảng viên hướng dẫn: </w:t>
+      </w:r>
+      <w:r>
+        <w:rPr>
+          <w:sz w:val="24"/>
+        </w:rPr>
+        <w:t>Đỗ Công Thuần</w:t>
+      </w:r>
+    </w:p>
+    <w:p>
+      <w:pPr>
+        <w:spacing w:after="880"/>
+        <w:jc w:val="center"/>
+      </w:pPr>
+    </w:p>
+    <w:p>
+      <w:pPr>
+        <w:spacing w:after="0"/>
+        <w:jc w:val="center"/>
+      </w:pPr>
+      <w:r>
+        <w:rPr>
+          <w:b w:val="0"/>
+          <w:i/>
+          <w:sz w:val="22"/>
+        </w:rPr>
+        <w:t>Hà Nội, tháng 7 năm 2026</w:t>
+      </w:r>
+    </w:p>
+    <w:p>
+      <w:pPr>
+        <w:pageBreakBefore/>
+        <w:spacing w:after="320"/>
+        <w:jc w:val="center"/>
+      </w:pPr>
+      <w:r>
+        <w:rPr>
+          <w:b/>
+          <w:i w:val="0"/>
+          <w:sz w:val="32"/>
+        </w:rPr>
+        <w:t>MỤC LỤC</w:t>
+      </w:r>
+    </w:p>
+    <w:p>
+      <w:pPr/>
+      <w:r>
+        <w:fldChar w:fldCharType="begin" w:dirty="true"/>
+      </w:r>
+      <w:r>
+        <w:instrText xml:space="preserve"> TOC \o "1-3" \h \z \u </w:instrText>
+      </w:r>
+      <w:r>
+        <w:fldChar w:fldCharType="separate"/>
+      </w:r>
+      <w:r>
+        <w:rPr>
+          <w:i/>
+          <w:sz w:val="20"/>
+        </w:rPr>
+        <w:t>Mục lục tự động. Mở file bằng Word / ONLYOFFICE / WPS rồi bấm chuột phải vào đây → Update field (ONLYOFFICE: Refresh) để hiện đầy đủ đề mục kèm SỐ TRANG do chính trình soạn thảo tính.</w:t>
+      </w:r>
+      <w:r>
+        <w:fldChar w:fldCharType="end"/>
+      </w:r>
+    </w:p>
+    <w:p>
+      <w:pPr>
+        <w:pageBreakBefore/>
         <w:pStyle w:val="721"/>
       </w:pPr>
       <w:r>
@@ -11829,6 +12028,7 @@
       </w:r>
     </w:p>
     <w:sectPr>
+      <w:footerReference w:type="default" r:id="rId14"/>
       <w:footnotePr/>
       <w:endnotePr/>
       <w:type w:val="nextPage"/>
@@ -11874,6 +12074,36 @@
     </w:p>
   </w:endnote>
 </w:endnotes>
+</file>
+
+<file path=word/footer1.xml><?xml version="1.0" encoding="utf-8"?>
+<w:ftr xmlns:m="http://schemas.openxmlformats.org/officeDocument/2006/math" xmlns:mc="http://schemas.openxmlformats.org/markup-compatibility/2006" xmlns:mo="http://schemas.microsoft.com/office/mac/office/2008/main" xmlns:mv="urn:schemas-microsoft-com:mac:vml" xmlns:o="urn:schemas-microsoft-com:office:office" xmlns:r="http://schemas.openxmlformats.org/officeDocument/2006/relationships" xmlns:v="urn:schemas-microsoft-com:vml" xmlns:w10="urn:schemas-microsoft-com:office:word" xmlns:w14="http://schemas.microsoft.com/office/word/2010/wordml" xmlns:w="http://schemas.openxmlformats.org/wordprocessingml/2006/main" xmlns:wne="http://schemas.microsoft.com/office/word/2006/wordml" xmlns:wp14="http://schemas.microsoft.com/office/word/2010/wordprocessingDrawing" xmlns:wp="http://schemas.openxmlformats.org/drawingml/2006/wordprocessingDrawing" xmlns:wpc="http://schemas.microsoft.com/office/word/2010/wordprocessingCanvas" xmlns:wpg="http://schemas.microsoft.com/office/word/2010/wordprocessingGroup" xmlns:wpi="http://schemas.microsoft.com/office/word/2010/wordprocessingInk" xmlns:wps="http://schemas.microsoft.com/office/word/2010/wordprocessingShape" mc:Ignorable="w14 wp14">
+  <w:p>
+    <w:pPr>
+      <w:pStyle w:val="Footer"/>
+      <w:jc w:val="center"/>
+    </w:pPr>
+    <w:r>
+      <w:fldChar w:fldCharType="begin" w:dirty="true"/>
+    </w:r>
+    <w:r>
+      <w:instrText xml:space="preserve"> PAGE </w:instrText>
+    </w:r>
+    <w:r>
+      <w:fldChar w:fldCharType="separate"/>
+    </w:r>
+    <w:r>
+      <w:rPr>
+        <w:i/>
+        <w:sz w:val="20"/>
+      </w:rPr>
+      <w:t>1</w:t>
+    </w:r>
+    <w:r>
+      <w:fldChar w:fldCharType="end"/>
+    </w:r>
+  </w:p>
+</w:ftr>
 </file>
 
 <file path=word/footnotes.xml><?xml version="1.0" encoding="utf-8"?>

</xml_diff>

<commit_message>
Put the HUST logo on both report covers
The source file is a .webp in non_core/, which python-docx cannot embed and which
is gitignored, so it is converted to a transparent PNG and kept in docs/img/
alongside the reports it belongs to.

Placed above the university header at 1.4in tall; the large vertical spacers on
the cover are tightened to absorb its height so the cover still fits one page.
</commit_message>
<xml_diff>
--- a/docs/BaoCaoDoAn.docx
+++ b/docs/BaoCaoDoAn.docx
@@ -2,6 +2,46 @@
 <file path=word/document.xml><?xml version="1.0" encoding="utf-8"?>
 <w:document xmlns:wpc="http://schemas.microsoft.com/office/word/2010/wordprocessingCanvas" xmlns:mc="http://schemas.openxmlformats.org/markup-compatibility/2006" xmlns:o="urn:schemas-microsoft-com:office:office" xmlns:r="http://schemas.openxmlformats.org/officeDocument/2006/relationships" xmlns:m="http://schemas.openxmlformats.org/officeDocument/2006/math" xmlns:v="urn:schemas-microsoft-com:vml" xmlns:wp="http://schemas.openxmlformats.org/drawingml/2006/wordprocessingDrawing" xmlns:w="http://schemas.openxmlformats.org/wordprocessingml/2006/main" xmlns:wpg="http://schemas.microsoft.com/office/word/2010/wordprocessingGroup" xmlns:wpi="http://schemas.microsoft.com/office/word/2010/wordprocessingInk" xmlns:a="http://schemas.openxmlformats.org/drawingml/2006/main" xmlns:wne="http://schemas.microsoft.com/office/word/2006/wordml" xmlns:wps="http://schemas.microsoft.com/office/word/2010/wordprocessingShape" xmlns:w10="urn:schemas-microsoft-com:office:word" xmlns:wp14="http://schemas.microsoft.com/office/word/2010/wordprocessingDrawing" xmlns:w14="http://schemas.microsoft.com/office/word/2010/wordml" xmlns:w15="http://schemas.microsoft.com/office/word/2012/wordml" xmlns:w16cex="http://schemas.microsoft.com/office/word/2018/wordml/cex" xmlns:w16cid="http://schemas.microsoft.com/office/word/2016/wordml/cid" xmlns:w16="http://schemas.microsoft.com/office/word/2018/wordml" xmlns:w16sdtdh="http://schemas.microsoft.com/office/word/2020/wordml/sdtdatahash" xmlns:w16se="http://schemas.microsoft.com/office/word/2015/wordml/symex" mc:Ignorable="w14 w15 w16se w16cid w16 w16cex w16sdtdh wp14">
   <w:body>
+    <w:p>
+      <w:pPr>
+        <w:spacing w:after="200"/>
+        <w:jc w:val="center"/>
+      </w:pPr>
+      <w:r>
+        <w:drawing>
+          <wp:inline xmlns:pic="http://schemas.openxmlformats.org/drawingml/2006/picture">
+            <wp:extent cx="853440" cy="1280160"/>
+            <wp:docPr id="6" name="Picture 6"/>
+            <wp:cNvGraphicFramePr>
+              <a:graphicFrameLocks noChangeAspect="1"/>
+            </wp:cNvGraphicFramePr>
+            <a:graphic>
+              <a:graphicData uri="http://schemas.openxmlformats.org/drawingml/2006/picture">
+                <pic:pic>
+                  <pic:nvPicPr>
+                    <pic:cNvPr id="0" name="logo_hust.png"/>
+                    <pic:cNvPicPr/>
+                  </pic:nvPicPr>
+                  <pic:blipFill>
+                    <a:blip r:embed="rId15"/>
+                    <a:stretch>
+                      <a:fillRect/>
+                    </a:stretch>
+                  </pic:blipFill>
+                  <pic:spPr>
+                    <a:xfrm>
+                      <a:off x="0" y="0"/>
+                      <a:ext cx="853440" cy="1280160"/>
+                    </a:xfrm>
+                    <a:prstGeom prst="rect"/>
+                  </pic:spPr>
+                </pic:pic>
+              </a:graphicData>
+            </a:graphic>
+          </wp:inline>
+        </w:drawing>
+      </w:r>
+    </w:p>
     <w:p>
       <w:pPr>
         <w:spacing w:after="40"/>
@@ -18,7 +58,7 @@
     </w:p>
     <w:p>
       <w:pPr>
-        <w:spacing w:after="1040"/>
+        <w:spacing w:after="600"/>
         <w:jc w:val="center"/>
       </w:pPr>
       <w:r>
@@ -74,7 +114,7 @@
     </w:p>
     <w:p>
       <w:pPr>
-        <w:spacing w:after="1120"/>
+        <w:spacing w:after="680"/>
         <w:jc w:val="center"/>
       </w:pPr>
       <w:r>
@@ -145,7 +185,7 @@
     </w:p>
     <w:p>
       <w:pPr>
-        <w:spacing w:after="880"/>
+        <w:spacing w:after="480"/>
         <w:jc w:val="center"/>
       </w:pPr>
     </w:p>

</xml_diff>